<commit_message>
Finalize verified TW6 team-accepted report and release records
</commit_message>
<xml_diff>
--- a/team_integration_workspace/review/diffusion_agent/Special_Dark_TW6_Team_Agent_Record.docx
+++ b/team_integration_workspace/review/diffusion_agent/Special_Dark_TW6_Team_Agent_Record.docx
@@ -37,7 +37,7 @@
         <w:jc w:val="left"/>
       </w:pPr>
       <w:r>
-        <w:t xml:space="preserve">We recommend a diffusion expert for the team’s human-supervised chart-review application. General agent scaling is visible in a bounded survey, while exact-application and peer diffusion remain unknown. Factor priority depends on permissions and support capacity. This version is prepared for team review.</w:t>
+        <w:t xml:space="preserve">The team has accepted this diffusion expert for its human-supervised chart-review application. General agent scaling is visible in a bounded survey, while exact-application and peer diffusion remain unknown. Factor priority depends on permissions and support capacity. Version 1.0 records the accepted synthesis.</w:t>
       </w:r>
     </w:p>
     <w:p>
@@ -265,7 +265,7 @@
               <w:rPr>
                 <w:sz w:val="17"/>
               </w:rPr>
-              <w:t xml:space="preserve">October 27, 2026. Version 0.9-proposed. Comparison and recommendation version; team acceptance is a separate release step.</w:t>
+              <w:t xml:space="preserve">October 27, 2026. Version 1.0. Team acceptance and public-release authorization reported by Yufei Cai.</w:t>
             </w:r>
           </w:p>
         </w:tc>
@@ -366,12 +366,15 @@
             <w:pPr>
               <w:spacing w:after="20"/>
             </w:pPr>
-            <w:r>
-              <w:rPr>
-                <w:sz w:val="17"/>
-              </w:rPr>
-              <w:t xml:space="preserve">Local branch tw6-diffusion-20261027. Public push awaits authorization.</w:t>
-            </w:r>
+            <w:hyperlink r:id="rIdTW6ReleaseBranch">
+              <w:r>
+                <w:rPr>
+                  <w:sz w:val="17"/>
+                  <w:color w:val="0563C1"/>
+                </w:rPr>
+                <w:t>tw6-diffusion-20261027</w:t>
+              </w:r>
+            </w:hyperlink>
           </w:p>
         </w:tc>
       </w:tr>
@@ -417,12 +420,15 @@
             <w:pPr>
               <w:spacing w:after="20"/>
             </w:pPr>
-            <w:r>
-              <w:rPr>
-                <w:sz w:val="17"/>
-              </w:rPr>
-              <w:t xml:space="preserve">661d09f571a78a95bbee8c8c18763f2986e40d0e — local source anchor, not yet published.</w:t>
-            </w:r>
+            <w:hyperlink r:id="rIdTW6ReleaseCommit">
+              <w:r>
+                <w:rPr>
+                  <w:sz w:val="17"/>
+                  <w:color w:val="0563C1"/>
+                </w:rPr>
+                <w:t>8e33e86307d8280383d1cfebfd43041a87577bde</w:t>
+              </w:r>
+            </w:hyperlink>
           </w:p>
         </w:tc>
       </w:tr>
@@ -1354,7 +1360,7 @@
         <w:jc w:val="left"/>
       </w:pPr>
       <w:r>
-        <w:t xml:space="preserve">Recommended decision for review: retain the shared agentic chart-review scope, accept the bounded general scaling signal, withhold a measured application/peer stage, and use a conditional factor priority. The recommendation preserves the strongest design disagreement rather than resolving it by majority vote.</w:t>
+        <w:t xml:space="preserve">Accepted team decision: retain the shared agentic chart-review scope, accept the bounded general scaling signal, withhold a measured application/peer stage, and use a conditional factor priority. The synthesis preserves the strongest design disagreement rather than resolving it by majority vote.</w:t>
       </w:r>
     </w:p>
     <w:p>
@@ -1916,7 +1922,7 @@
               <w:rPr>
                 <w:sz w:val="17"/>
               </w:rPr>
-              <w:t xml:space="preserve">Yes as a bounded review candidate: scope, dated evidence, all five factors, dissent, saved tests and permission constraints are explicit. It is not yet a team-accepted release.</w:t>
+              <w:t xml:space="preserve">The team has accepted version 1.0, as reported by Yufei Cai. Scope, dated evidence, all five factors, dissent, saved tests and permission constraints are explicit. This academic acceptance does not approve a real organizational trial.</w:t>
             </w:r>
           </w:p>
         </w:tc>
@@ -2336,7 +2342,7 @@
         <w:jc w:val="left"/>
       </w:pPr>
       <w:r>
-        <w:t xml:space="preserve">These contributions are grounded in the supplied Lab5 artifacts. Consolidation has compared the designs, preserved weaknesses, checked selected current sources and prepared shared records and the Adoption handoff. The next human review should accept or amend the recommendation before release.</w:t>
+        <w:t xml:space="preserve">These contributions are grounded in the supplied Lab5 artifacts. Consolidation compared the designs, preserved weaknesses, checked selected current sources and prepared shared records and the Adoption handoff. Yufei Cai subsequently reported team acceptance and authorized public upload and a review PR. No classroom completion percentage is asserted.</w:t>
       </w:r>
     </w:p>
     <w:p>
@@ -3197,7 +3203,7 @@
         <w:jc w:val="left"/>
       </w:pPr>
       <w:r>
-        <w:t xml:space="preserve">Prepared shared-record updates identify the proposed Diffusion Agent in slot 4 and append the recommendation and dissent. Public push awaits authorization. Current main contains TW3; TW4 PR4 and TW5 PR5 remain separate open reviews. This version does not merge them or rewrite earlier records. Human acceptance is needed before promoting 0.9-proposed to an approved release.</w:t>
+        <w:t xml:space="preserve">Shared records identify the team-accepted Diffusion Agent 1.0 in slot 4 and append the accepted judgment and dissent. Public upload and a review PR were authorized by Yufei Cai. Current main contains TW3; TW4 PR4 and TW5 PR5 remain separate open reviews. This release does not merge main, merge those reviews or edit members’ individual branches.</w:t>
       </w:r>
     </w:p>
     <w:p>
@@ -3266,7 +3272,7 @@
         <w:color w:val="666666"/>
         <w:sz w:val="16"/>
       </w:rPr>
-      <w:t xml:space="preserve">Special Dark   TW6 Diffusion Agent   Proposed for team review</w:t>
+      <w:t xml:space="preserve">Special Dark   TW6 Diffusion Agent   Team accepted version 1.0</w:t>
     </w:r>
   </w:p>
 </w:ftr>

</xml_diff>